<commit_message>
docs: link screen groups to main navigation
</commit_message>
<xml_diff>
--- a/docs/كراسة_نظام_تصميم_TransportERP_الموحدة_الكاملة_الإصدار_1.11.docx
+++ b/docs/كراسة_نظام_تصميم_TransportERP_الموحدة_الكاملة_الإصدار_1.11.docx
@@ -40675,6 +40675,537 @@
     </w:tbl>
     <w:bookmarkEnd w:id="24"/>
     <w:bookmarkEnd w:id="25"/>
+    <w:p>
+      <w:r>
+        <w:br w:type="page"/>
+      </w:r>
+    </w:p>
+    <w:p>
+      <w:pPr>
+        <w:pStyle w:val="Heading1"/>
+        <w:jc w:val="right"/>
+        <w:bidi w:val="1"/>
+      </w:pPr>
+      <w:r>
+        <w:rPr>
+          <w:b/>
+          <w:rtl w:val="1"/>
+        </w:rPr>
+        <w:t>ربط المجموعات بالشاشة الرئيسية</w:t>
+      </w:r>
+    </w:p>
+    <w:p>
+      <w:pPr>
+        <w:jc w:val="right"/>
+        <w:bidi w:val="1"/>
+      </w:pPr>
+      <w:r>
+        <w:rPr>
+          <w:b w:val="0"/>
+          <w:rtl w:val="1"/>
+        </w:rPr>
+        <w:t>هذا القسم يحدد مكان الوصول إلى شاشات المجموعات الثانية والثالثة والرابعة من الشاشة الرئيسية. وهو مرجع تصميم وتنقل؛ ولا يجيز بدء التنفيذ البرمجي قبل اعتماد كتاب الشاشات النهائي.</w:t>
+      </w:r>
+    </w:p>
+    <w:p>
+      <w:pPr>
+        <w:pStyle w:val="Heading2"/>
+        <w:jc w:val="right"/>
+        <w:bidi w:val="1"/>
+      </w:pPr>
+      <w:r>
+        <w:rPr>
+          <w:b w:val="0"/>
+          <w:rtl w:val="1"/>
+        </w:rPr>
+        <w:t>قاعدة الربط</w:t>
+      </w:r>
+    </w:p>
+    <w:p>
+      <w:pPr>
+        <w:jc w:val="right"/>
+        <w:bidi w:val="1"/>
+      </w:pPr>
+      <w:r>
+        <w:rPr>
+          <w:b w:val="0"/>
+          <w:rtl w:val="1"/>
+        </w:rPr>
+        <w:t>تظهر الوحدات في شجرة التنقل اليمنى للشاشة الرئيسية، ويؤدي اختيار أي عنصر إلى فتح الشاشة في تبويب مستقل ضمن منطقة العمل. تبقى بيانات الجلسة والسياق العام في الغلاف الرئيسي فقط ولا تتكرر داخل كل شاشة.</w:t>
+      </w:r>
+    </w:p>
+    <w:tbl>
+      <w:tblPr>
+        <w:tblStyle w:val="TableGrid"/>
+        <w:tblW w:type="auto" w:w="0"/>
+        <w:tblLook w:firstColumn="1" w:firstRow="1" w:lastColumn="0" w:lastRow="0" w:noHBand="0" w:noVBand="1" w:val="04A0"/>
+      </w:tblPr>
+      <w:tblGrid>
+        <w:gridCol w:w="2412"/>
+        <w:gridCol w:w="2412"/>
+        <w:gridCol w:w="2412"/>
+        <w:gridCol w:w="2412"/>
+      </w:tblGrid>
+      <w:tr>
+        <w:tc>
+          <w:tcPr>
+            <w:tcW w:type="dxa" w:w="2412"/>
+            <w:shd w:fill="1F4E78"/>
+          </w:tcPr>
+          <w:p>
+            <w:pPr>
+              <w:jc w:val="right"/>
+              <w:bidi w:val="1"/>
+            </w:pPr>
+            <w:r>
+              <w:rPr>
+                <w:rtl w:val="1"/>
+              </w:rPr>
+            </w:r>
+            <w:r>
+              <w:rPr>
+                <w:b/>
+                <w:rtl w:val="1"/>
+              </w:rPr>
+              <w:t>المجموعة</w:t>
+            </w:r>
+          </w:p>
+        </w:tc>
+        <w:tc>
+          <w:tcPr>
+            <w:tcW w:type="dxa" w:w="2412"/>
+            <w:shd w:fill="1F4E78"/>
+          </w:tcPr>
+          <w:p>
+            <w:pPr>
+              <w:jc w:val="right"/>
+              <w:bidi w:val="1"/>
+            </w:pPr>
+            <w:r>
+              <w:rPr>
+                <w:rtl w:val="1"/>
+              </w:rPr>
+            </w:r>
+            <w:r>
+              <w:rPr>
+                <w:b/>
+                <w:rtl w:val="1"/>
+              </w:rPr>
+              <w:t>موقعها في شجرة الشاشة الرئيسية</w:t>
+            </w:r>
+          </w:p>
+        </w:tc>
+        <w:tc>
+          <w:tcPr>
+            <w:tcW w:type="dxa" w:w="2412"/>
+            <w:shd w:fill="1F4E78"/>
+          </w:tcPr>
+          <w:p>
+            <w:pPr>
+              <w:jc w:val="right"/>
+              <w:bidi w:val="1"/>
+            </w:pPr>
+            <w:r>
+              <w:rPr>
+                <w:rtl w:val="1"/>
+              </w:rPr>
+            </w:r>
+            <w:r>
+              <w:rPr>
+                <w:b/>
+                <w:rtl w:val="1"/>
+              </w:rPr>
+              <w:t>عدد الشاشات</w:t>
+            </w:r>
+          </w:p>
+        </w:tc>
+        <w:tc>
+          <w:tcPr>
+            <w:tcW w:type="dxa" w:w="2412"/>
+            <w:shd w:fill="1F4E78"/>
+          </w:tcPr>
+          <w:p>
+            <w:pPr>
+              <w:jc w:val="right"/>
+              <w:bidi w:val="1"/>
+            </w:pPr>
+            <w:r>
+              <w:rPr>
+                <w:rtl w:val="1"/>
+              </w:rPr>
+            </w:r>
+            <w:r>
+              <w:rPr>
+                <w:b/>
+                <w:rtl w:val="1"/>
+              </w:rPr>
+              <w:t>طريقة الفتح</w:t>
+            </w:r>
+          </w:p>
+        </w:tc>
+      </w:tr>
+      <w:tr>
+        <w:tc>
+          <w:tcPr>
+            <w:tcW w:type="dxa" w:w="2412"/>
+          </w:tcPr>
+          <w:p>
+            <w:pPr>
+              <w:jc w:val="right"/>
+              <w:bidi w:val="1"/>
+            </w:pPr>
+            <w:r>
+              <w:rPr>
+                <w:rtl w:val="1"/>
+              </w:rPr>
+            </w:r>
+            <w:r>
+              <w:rPr>
+                <w:b w:val="0"/>
+                <w:rtl w:val="1"/>
+              </w:rPr>
+              <w:t>المجموعة الثانية — التهيئة العامة</w:t>
+            </w:r>
+          </w:p>
+        </w:tc>
+        <w:tc>
+          <w:tcPr>
+            <w:tcW w:type="dxa" w:w="2412"/>
+          </w:tcPr>
+          <w:p>
+            <w:pPr>
+              <w:jc w:val="right"/>
+              <w:bidi w:val="1"/>
+            </w:pPr>
+            <w:r>
+              <w:rPr>
+                <w:rtl w:val="1"/>
+              </w:rPr>
+            </w:r>
+            <w:r>
+              <w:rPr>
+                <w:b w:val="0"/>
+                <w:rtl w:val="1"/>
+              </w:rPr>
+              <w:t>الإعدادات ← التهيئة العامة</w:t>
+            </w:r>
+          </w:p>
+        </w:tc>
+        <w:tc>
+          <w:tcPr>
+            <w:tcW w:type="dxa" w:w="2412"/>
+          </w:tcPr>
+          <w:p>
+            <w:pPr>
+              <w:jc w:val="right"/>
+              <w:bidi w:val="1"/>
+            </w:pPr>
+            <w:r>
+              <w:rPr>
+                <w:rtl w:val="1"/>
+              </w:rPr>
+            </w:r>
+            <w:r>
+              <w:rPr>
+                <w:b w:val="0"/>
+                <w:rtl w:val="1"/>
+              </w:rPr>
+              <w:t>9</w:t>
+            </w:r>
+          </w:p>
+        </w:tc>
+        <w:tc>
+          <w:tcPr>
+            <w:tcW w:type="dxa" w:w="2412"/>
+          </w:tcPr>
+          <w:p>
+            <w:pPr>
+              <w:jc w:val="right"/>
+              <w:bidi w:val="1"/>
+            </w:pPr>
+            <w:r>
+              <w:rPr>
+                <w:rtl w:val="1"/>
+              </w:rPr>
+            </w:r>
+            <w:r>
+              <w:rPr>
+                <w:b w:val="0"/>
+                <w:rtl w:val="1"/>
+              </w:rPr>
+              <w:t>تبويب نافذة مستقل</w:t>
+            </w:r>
+          </w:p>
+        </w:tc>
+      </w:tr>
+      <w:tr>
+        <w:tc>
+          <w:tcPr>
+            <w:tcW w:type="dxa" w:w="2412"/>
+          </w:tcPr>
+          <w:p>
+            <w:pPr>
+              <w:jc w:val="right"/>
+              <w:bidi w:val="1"/>
+            </w:pPr>
+            <w:r>
+              <w:rPr>
+                <w:rtl w:val="1"/>
+              </w:rPr>
+            </w:r>
+            <w:r>
+              <w:rPr>
+                <w:b w:val="0"/>
+                <w:rtl w:val="1"/>
+              </w:rPr>
+              <w:t>المجموعة الثالثة — الأمن والإدارة</w:t>
+            </w:r>
+          </w:p>
+        </w:tc>
+        <w:tc>
+          <w:tcPr>
+            <w:tcW w:type="dxa" w:w="2412"/>
+          </w:tcPr>
+          <w:p>
+            <w:pPr>
+              <w:jc w:val="right"/>
+              <w:bidi w:val="1"/>
+            </w:pPr>
+            <w:r>
+              <w:rPr>
+                <w:rtl w:val="1"/>
+              </w:rPr>
+            </w:r>
+            <w:r>
+              <w:rPr>
+                <w:b w:val="0"/>
+                <w:rtl w:val="1"/>
+              </w:rPr>
+              <w:t>الإدارة ← الأمن والإدارة</w:t>
+            </w:r>
+          </w:p>
+        </w:tc>
+        <w:tc>
+          <w:tcPr>
+            <w:tcW w:type="dxa" w:w="2412"/>
+          </w:tcPr>
+          <w:p>
+            <w:pPr>
+              <w:jc w:val="right"/>
+              <w:bidi w:val="1"/>
+            </w:pPr>
+            <w:r>
+              <w:rPr>
+                <w:rtl w:val="1"/>
+              </w:rPr>
+            </w:r>
+            <w:r>
+              <w:rPr>
+                <w:b w:val="0"/>
+                <w:rtl w:val="1"/>
+              </w:rPr>
+              <w:t>18</w:t>
+            </w:r>
+          </w:p>
+        </w:tc>
+        <w:tc>
+          <w:tcPr>
+            <w:tcW w:type="dxa" w:w="2412"/>
+          </w:tcPr>
+          <w:p>
+            <w:pPr>
+              <w:jc w:val="right"/>
+              <w:bidi w:val="1"/>
+            </w:pPr>
+            <w:r>
+              <w:rPr>
+                <w:rtl w:val="1"/>
+              </w:rPr>
+            </w:r>
+            <w:r>
+              <w:rPr>
+                <w:b w:val="0"/>
+                <w:rtl w:val="1"/>
+              </w:rPr>
+              <w:t>تبويب نافذة مستقل</w:t>
+            </w:r>
+          </w:p>
+        </w:tc>
+      </w:tr>
+      <w:tr>
+        <w:tc>
+          <w:tcPr>
+            <w:tcW w:type="dxa" w:w="2412"/>
+          </w:tcPr>
+          <w:p>
+            <w:pPr>
+              <w:jc w:val="right"/>
+              <w:bidi w:val="1"/>
+            </w:pPr>
+            <w:r>
+              <w:rPr>
+                <w:rtl w:val="1"/>
+              </w:rPr>
+            </w:r>
+            <w:r>
+              <w:rPr>
+                <w:b w:val="0"/>
+                <w:rtl w:val="1"/>
+              </w:rPr>
+              <w:t>المجموعة الرابعة — المحاسبة</w:t>
+            </w:r>
+          </w:p>
+        </w:tc>
+        <w:tc>
+          <w:tcPr>
+            <w:tcW w:type="dxa" w:w="2412"/>
+          </w:tcPr>
+          <w:p>
+            <w:pPr>
+              <w:jc w:val="right"/>
+              <w:bidi w:val="1"/>
+            </w:pPr>
+            <w:r>
+              <w:rPr>
+                <w:rtl w:val="1"/>
+              </w:rPr>
+            </w:r>
+            <w:r>
+              <w:rPr>
+                <w:b w:val="0"/>
+                <w:rtl w:val="1"/>
+              </w:rPr>
+              <w:t>المالية ← المحاسبة</w:t>
+            </w:r>
+          </w:p>
+        </w:tc>
+        <w:tc>
+          <w:tcPr>
+            <w:tcW w:type="dxa" w:w="2412"/>
+          </w:tcPr>
+          <w:p>
+            <w:pPr>
+              <w:jc w:val="right"/>
+              <w:bidi w:val="1"/>
+            </w:pPr>
+            <w:r>
+              <w:rPr>
+                <w:rtl w:val="1"/>
+              </w:rPr>
+            </w:r>
+            <w:r>
+              <w:rPr>
+                <w:b w:val="0"/>
+                <w:rtl w:val="1"/>
+              </w:rPr>
+              <w:t>44</w:t>
+            </w:r>
+          </w:p>
+        </w:tc>
+        <w:tc>
+          <w:tcPr>
+            <w:tcW w:type="dxa" w:w="2412"/>
+          </w:tcPr>
+          <w:p>
+            <w:pPr>
+              <w:jc w:val="right"/>
+              <w:bidi w:val="1"/>
+            </w:pPr>
+            <w:r>
+              <w:rPr>
+                <w:rtl w:val="1"/>
+              </w:rPr>
+            </w:r>
+            <w:r>
+              <w:rPr>
+                <w:b w:val="0"/>
+                <w:rtl w:val="1"/>
+              </w:rPr>
+              <w:t>تبويب نافذة مستقل</w:t>
+            </w:r>
+          </w:p>
+        </w:tc>
+      </w:tr>
+    </w:tbl>
+    <w:p>
+      <w:pPr>
+        <w:pStyle w:val="Heading2"/>
+        <w:jc w:val="right"/>
+        <w:bidi w:val="1"/>
+      </w:pPr>
+      <w:r>
+        <w:rPr>
+          <w:b w:val="0"/>
+          <w:rtl w:val="1"/>
+        </w:rPr>
+        <w:t>سلوك التنقل المعتمد</w:t>
+      </w:r>
+    </w:p>
+    <w:p>
+      <w:pPr>
+        <w:jc w:val="right"/>
+        <w:bidi w:val="1"/>
+      </w:pPr>
+      <w:r>
+        <w:rPr>
+          <w:b w:val="0"/>
+          <w:rtl w:val="1"/>
+        </w:rPr>
+        <w:t>• تعرض شجرة التنقل البحث والتصفية أعلى الشجرة، وتُظهر المجموعة ثم الشاشات التابعة لها.</w:t>
+      </w:r>
+    </w:p>
+    <w:p>
+      <w:pPr>
+        <w:jc w:val="right"/>
+        <w:bidi w:val="1"/>
+      </w:pPr>
+      <w:r>
+        <w:rPr>
+          <w:b w:val="0"/>
+          <w:rtl w:val="1"/>
+        </w:rPr>
+        <w:t>• تفتح الشاشة في تبويب جديد من اليمين؛ وإذا كانت مفتوحة مسبقًا يُفعّل تبويبها بدل تكراره.</w:t>
+      </w:r>
+    </w:p>
+    <w:p>
+      <w:pPr>
+        <w:jc w:val="right"/>
+        <w:bidi w:val="1"/>
+      </w:pPr>
+      <w:r>
+        <w:rPr>
+          <w:b w:val="0"/>
+          <w:rtl w:val="1"/>
+        </w:rPr>
+        <w:t>• يتم إغلاق الشاشة من تبويب النافذة وفق القرار UI-WIN-003، مع حفظ أو تجاهل التعديلات عند الحاجة.</w:t>
+      </w:r>
+    </w:p>
+    <w:p>
+      <w:pPr>
+        <w:jc w:val="right"/>
+        <w:bidi w:val="1"/>
+      </w:pPr>
+      <w:r>
+        <w:rPr>
+          <w:b w:val="0"/>
+          <w:rtl w:val="1"/>
+        </w:rPr>
+        <w:t>• تُطبق صلاحية المستخدم ونطاق الشركة والفرع والسنة المالية قبل إظهار العنصر أو فتحه.</w:t>
+      </w:r>
+    </w:p>
+    <w:p>
+      <w:pPr>
+        <w:jc w:val="right"/>
+        <w:bidi w:val="1"/>
+      </w:pPr>
+      <w:r>
+        <w:rPr>
+          <w:b w:val="0"/>
+          <w:rtl w:val="1"/>
+        </w:rPr>
+        <w:t>• لا تُنفذ هذه الخريطة برمجيًا قبل اعتماد الكراسة النهائية للشاشات.</w:t>
+      </w:r>
+    </w:p>
     <w:sectPr>
       <w:pgSz w:w="12240" w:h="15840"/>
       <w:pgMar w:top="1296" w:right="1296" w:bottom="1296" w:left="1296" w:header="720" w:footer="720" w:gutter="0"/>

</xml_diff>